<commit_message>
Prepare ESP32 Level 1 course review package
</commit_message>
<xml_diff>
--- a/learning/esp32-cpp/downloads/Lesson 1 Complete Teaching Packet.docx
+++ b/learning/esp32-cpp/downloads/Lesson 1 Complete Teaching Packet.docx
@@ -2832,150 +2832,6 @@
       </w:tr>
     </w:tbl>
     <w:p/>
-    <w:p>
-      <w:pPr>
-        <w:pStyle w:val="Heading1"/>
-      </w:pPr>
-      <w:r>
-        <w:t>Files in This Lesson Folder</w:t>
-      </w:r>
-    </w:p>
-    <w:p>
-      <w:pPr>
-        <w:pStyle w:val="ListBullet"/>
-      </w:pPr>
-      <w:r>
-        <w:rPr>
-          <w:rFonts w:ascii="Aptos" w:hAnsi="Aptos"/>
-        </w:rPr>
-        <w:t>Lesson 1 Teacher Lesson Plan What Is Cpp.docx</w:t>
-      </w:r>
-    </w:p>
-    <w:p>
-      <w:pPr>
-        <w:pStyle w:val="ListBullet"/>
-      </w:pPr>
-      <w:r>
-        <w:rPr>
-          <w:rFonts w:ascii="Aptos" w:hAnsi="Aptos"/>
-        </w:rPr>
-        <w:t>Lesson 1 Student Workbook What Is Cpp.docx</w:t>
-      </w:r>
-    </w:p>
-    <w:p>
-      <w:pPr>
-        <w:pStyle w:val="ListBullet"/>
-      </w:pPr>
-      <w:r>
-        <w:rPr>
-          <w:rFonts w:ascii="Aptos" w:hAnsi="Aptos"/>
-        </w:rPr>
-        <w:t>Lesson 1 Exercises What Is Cpp.docx</w:t>
-      </w:r>
-    </w:p>
-    <w:p>
-      <w:pPr>
-        <w:pStyle w:val="ListBullet"/>
-      </w:pPr>
-      <w:r>
-        <w:rPr>
-          <w:rFonts w:ascii="Aptos" w:hAnsi="Aptos"/>
-        </w:rPr>
-        <w:t>Lesson 1 Instructor Answer Key What Is Cpp.docx</w:t>
-      </w:r>
-    </w:p>
-    <w:p>
-      <w:pPr>
-        <w:pStyle w:val="ListBullet"/>
-      </w:pPr>
-      <w:r>
-        <w:rPr>
-          <w:rFonts w:ascii="Aptos" w:hAnsi="Aptos"/>
-        </w:rPr>
-        <w:t>Lesson 1 Video Series Script and Artwork Brief.docx</w:t>
-      </w:r>
-    </w:p>
-    <w:p>
-      <w:pPr>
-        <w:pStyle w:val="ListBullet"/>
-      </w:pPr>
-      <w:r>
-        <w:rPr>
-          <w:rFonts w:ascii="Aptos" w:hAnsi="Aptos"/>
-        </w:rPr>
-        <w:t>Artwork Samples folder</w:t>
-      </w:r>
-    </w:p>
-    <w:p>
-      <w:pPr>
-        <w:pStyle w:val="ListBullet"/>
-      </w:pPr>
-      <w:r>
-        <w:rPr>
-          <w:rFonts w:ascii="Aptos" w:hAnsi="Aptos"/>
-        </w:rPr>
-        <w:t>Student Starter Code folder</w:t>
-      </w:r>
-    </w:p>
-    <w:p>
-      <w:pPr>
-        <w:pStyle w:val="Heading1"/>
-      </w:pPr>
-      <w:r>
-        <w:t>Video Draft Status</w:t>
-      </w:r>
-    </w:p>
-    <w:p>
-      <w:r>
-        <w:rPr>
-          <w:rFonts w:ascii="Aptos" w:hAnsi="Aptos"/>
-          <w:b/>
-          <w:sz w:val="21"/>
-        </w:rPr>
-        <w:t xml:space="preserve">Lesson 1 video draft created: </w:t>
-      </w:r>
-      <w:r>
-        <w:rPr>
-          <w:rFonts w:ascii="Aptos" w:hAnsi="Aptos"/>
-          <w:sz w:val="21"/>
-        </w:rPr>
-        <w:t>C:\CppCourse\Level 1 Cpp Foundations\01 What Is Cpp\Video Draft\Lesson 1 What Is Cpp Draft Better Voice.mp4</w:t>
-      </w:r>
-    </w:p>
-    <w:p>
-      <w:r>
-        <w:rPr>
-          <w:rFonts w:ascii="Aptos" w:hAnsi="Aptos"/>
-          <w:b/>
-          <w:sz w:val="21"/>
-        </w:rPr>
-        <w:t xml:space="preserve">Production package: </w:t>
-      </w:r>
-      <w:r>
-        <w:rPr>
-          <w:rFonts w:ascii="Aptos" w:hAnsi="Aptos"/>
-          <w:sz w:val="21"/>
-        </w:rPr>
-        <w:t>C:\CppCourse\Level 1 Cpp Foundations\Exports\Lesson 1 Video Draft Package.zip</w:t>
-      </w:r>
-    </w:p>
-    <w:p>
-      <w:r>
-        <w:rPr>
-          <w:rFonts w:ascii="Aptos" w:hAnsi="Aptos"/>
-          <w:b/>
-          <w:sz w:val="21"/>
-        </w:rPr>
-        <w:t xml:space="preserve">Review note: </w:t>
-      </w:r>
-      <w:r>
-        <w:rPr>
-          <w:rFonts w:ascii="Aptos" w:hAnsi="Aptos"/>
-          <w:sz w:val="21"/>
-        </w:rPr>
-        <w:t>This is a review draft with neural narration and scene-card visuals. Use it to check pacing, wording, and visual clarity before recording or publishing a final version.</w:t>
-      </w:r>
-    </w:p>
     <w:sectPr>
       <w:pgSz w:w="12240" w:h="15840"/>
       <w:pgMar w:top="936" w:right="1080" w:bottom="936" w:left="1080" w:header="720" w:footer="720" w:gutter="0"/>

</xml_diff>

<commit_message>
Prepare ESP32 C++ Level 1 classroom review package (#4)
Finalize the four Level 1 lessons, classroom documents, videos, narration-matched captions, transcripts, and teacher resources.
</commit_message>
<xml_diff>
--- a/learning/esp32-cpp/downloads/Lesson 1 Complete Teaching Packet.docx
+++ b/learning/esp32-cpp/downloads/Lesson 1 Complete Teaching Packet.docx
@@ -2832,150 +2832,6 @@
       </w:tr>
     </w:tbl>
     <w:p/>
-    <w:p>
-      <w:pPr>
-        <w:pStyle w:val="Heading1"/>
-      </w:pPr>
-      <w:r>
-        <w:t>Files in This Lesson Folder</w:t>
-      </w:r>
-    </w:p>
-    <w:p>
-      <w:pPr>
-        <w:pStyle w:val="ListBullet"/>
-      </w:pPr>
-      <w:r>
-        <w:rPr>
-          <w:rFonts w:ascii="Aptos" w:hAnsi="Aptos"/>
-        </w:rPr>
-        <w:t>Lesson 1 Teacher Lesson Plan What Is Cpp.docx</w:t>
-      </w:r>
-    </w:p>
-    <w:p>
-      <w:pPr>
-        <w:pStyle w:val="ListBullet"/>
-      </w:pPr>
-      <w:r>
-        <w:rPr>
-          <w:rFonts w:ascii="Aptos" w:hAnsi="Aptos"/>
-        </w:rPr>
-        <w:t>Lesson 1 Student Workbook What Is Cpp.docx</w:t>
-      </w:r>
-    </w:p>
-    <w:p>
-      <w:pPr>
-        <w:pStyle w:val="ListBullet"/>
-      </w:pPr>
-      <w:r>
-        <w:rPr>
-          <w:rFonts w:ascii="Aptos" w:hAnsi="Aptos"/>
-        </w:rPr>
-        <w:t>Lesson 1 Exercises What Is Cpp.docx</w:t>
-      </w:r>
-    </w:p>
-    <w:p>
-      <w:pPr>
-        <w:pStyle w:val="ListBullet"/>
-      </w:pPr>
-      <w:r>
-        <w:rPr>
-          <w:rFonts w:ascii="Aptos" w:hAnsi="Aptos"/>
-        </w:rPr>
-        <w:t>Lesson 1 Instructor Answer Key What Is Cpp.docx</w:t>
-      </w:r>
-    </w:p>
-    <w:p>
-      <w:pPr>
-        <w:pStyle w:val="ListBullet"/>
-      </w:pPr>
-      <w:r>
-        <w:rPr>
-          <w:rFonts w:ascii="Aptos" w:hAnsi="Aptos"/>
-        </w:rPr>
-        <w:t>Lesson 1 Video Series Script and Artwork Brief.docx</w:t>
-      </w:r>
-    </w:p>
-    <w:p>
-      <w:pPr>
-        <w:pStyle w:val="ListBullet"/>
-      </w:pPr>
-      <w:r>
-        <w:rPr>
-          <w:rFonts w:ascii="Aptos" w:hAnsi="Aptos"/>
-        </w:rPr>
-        <w:t>Artwork Samples folder</w:t>
-      </w:r>
-    </w:p>
-    <w:p>
-      <w:pPr>
-        <w:pStyle w:val="ListBullet"/>
-      </w:pPr>
-      <w:r>
-        <w:rPr>
-          <w:rFonts w:ascii="Aptos" w:hAnsi="Aptos"/>
-        </w:rPr>
-        <w:t>Student Starter Code folder</w:t>
-      </w:r>
-    </w:p>
-    <w:p>
-      <w:pPr>
-        <w:pStyle w:val="Heading1"/>
-      </w:pPr>
-      <w:r>
-        <w:t>Video Draft Status</w:t>
-      </w:r>
-    </w:p>
-    <w:p>
-      <w:r>
-        <w:rPr>
-          <w:rFonts w:ascii="Aptos" w:hAnsi="Aptos"/>
-          <w:b/>
-          <w:sz w:val="21"/>
-        </w:rPr>
-        <w:t xml:space="preserve">Lesson 1 video draft created: </w:t>
-      </w:r>
-      <w:r>
-        <w:rPr>
-          <w:rFonts w:ascii="Aptos" w:hAnsi="Aptos"/>
-          <w:sz w:val="21"/>
-        </w:rPr>
-        <w:t>C:\CppCourse\Level 1 Cpp Foundations\01 What Is Cpp\Video Draft\Lesson 1 What Is Cpp Draft Better Voice.mp4</w:t>
-      </w:r>
-    </w:p>
-    <w:p>
-      <w:r>
-        <w:rPr>
-          <w:rFonts w:ascii="Aptos" w:hAnsi="Aptos"/>
-          <w:b/>
-          <w:sz w:val="21"/>
-        </w:rPr>
-        <w:t xml:space="preserve">Production package: </w:t>
-      </w:r>
-      <w:r>
-        <w:rPr>
-          <w:rFonts w:ascii="Aptos" w:hAnsi="Aptos"/>
-          <w:sz w:val="21"/>
-        </w:rPr>
-        <w:t>C:\CppCourse\Level 1 Cpp Foundations\Exports\Lesson 1 Video Draft Package.zip</w:t>
-      </w:r>
-    </w:p>
-    <w:p>
-      <w:r>
-        <w:rPr>
-          <w:rFonts w:ascii="Aptos" w:hAnsi="Aptos"/>
-          <w:b/>
-          <w:sz w:val="21"/>
-        </w:rPr>
-        <w:t xml:space="preserve">Review note: </w:t>
-      </w:r>
-      <w:r>
-        <w:rPr>
-          <w:rFonts w:ascii="Aptos" w:hAnsi="Aptos"/>
-          <w:sz w:val="21"/>
-        </w:rPr>
-        <w:t>This is a review draft with neural narration and scene-card visuals. Use it to check pacing, wording, and visual clarity before recording or publishing a final version.</w:t>
-      </w:r>
-    </w:p>
     <w:sectPr>
       <w:pgSz w:w="12240" w:h="15840"/>
       <w:pgMar w:top="936" w:right="1080" w:bottom="936" w:left="1080" w:header="720" w:footer="720" w:gutter="0"/>

</xml_diff>